<commit_message>
Fill report dates and use full printable width
</commit_message>
<xml_diff>
--- a/apps/api/templates/Arbeitszeitaufzeichnung_Template.docx
+++ b/apps/api/templates/Arbeitszeitaufzeichnung_Template.docx
@@ -18,7 +18,8 @@
     </w:p>
     <w:tbl>
       <w:tblPr>
-        <w:tblW w:type="auto" w:w="0"/>
+        <w:tblW w:type="dxa" w:w="10710"/>
+        <w:jc w:val="center"/>
         <w:tblLayout w:type="fixed"/>
         <w:tblLook w:firstColumn="1" w:firstRow="1" w:lastColumn="0" w:lastRow="0" w:noHBand="0" w:noVBand="1" w:val="04A0"/>
       </w:tblPr>
@@ -146,7 +147,8 @@
     </w:p>
     <w:tbl>
       <w:tblPr>
-        <w:tblW w:type="auto" w:w="0"/>
+        <w:tblW w:type="dxa" w:w="10710"/>
+        <w:jc w:val="center"/>
         <w:tblLayout w:type="fixed"/>
         <w:tblLook w:firstColumn="1" w:firstRow="1" w:lastColumn="0" w:lastRow="0" w:noHBand="0" w:noVBand="1" w:val="04A0"/>
       </w:tblPr>
@@ -6456,7 +6458,8 @@
     </w:p>
     <w:tbl>
       <w:tblPr>
-        <w:tblW w:type="auto" w:w="0"/>
+        <w:tblW w:type="dxa" w:w="10710"/>
+        <w:jc w:val="center"/>
         <w:tblLayout w:type="fixed"/>
         <w:tblLook w:firstColumn="1" w:firstRow="1" w:lastColumn="0" w:lastRow="0" w:noHBand="0" w:noVBand="1" w:val="04A0"/>
       </w:tblPr>
@@ -6490,7 +6493,7 @@
               </w:rPr>
               <w:t>________________________</w:t>
               <w:br/>
-              <w:t>Datum</w:t>
+              <w:t>{{current_date}}</w:t>
             </w:r>
           </w:p>
         </w:tc>
@@ -6519,7 +6522,7 @@
               </w:rPr>
               <w:t>________________________</w:t>
               <w:br/>
-              <w:t>Datum</w:t>
+              <w:t>{{current_date}}</w:t>
             </w:r>
           </w:p>
         </w:tc>

</xml_diff>

<commit_message>
Polish document generator and report template
</commit_message>
<xml_diff>
--- a/apps/api/templates/Arbeitszeitaufzeichnung_Template.docx
+++ b/apps/api/templates/Arbeitszeitaufzeichnung_Template.docx
@@ -151,6 +151,9 @@
         <w:jc w:val="center"/>
         <w:tblLayout w:type="fixed"/>
         <w:tblLook w:firstColumn="1" w:firstRow="1" w:lastColumn="0" w:lastRow="0" w:noHBand="0" w:noVBand="1" w:val="04A0"/>
+        <w:tblBorders>
+          <w:top w:val="single" w:sz="6" w:color="000000"/>
+        </w:tblBorders>
       </w:tblPr>
       <w:tblGrid>
         <w:gridCol w:w="1530"/>
@@ -166,13 +169,13 @@
           <w:tcPr>
             <w:tcW w:type="dxa" w:w="822"/>
             <w:vMerge w:val="restart"/>
-            <w:vAlign w:val="center"/>
             <w:tcBorders>
               <w:top w:val="single" w:sz="6" w:color="000000"/>
               <w:left w:val="single" w:sz="6" w:color="000000"/>
               <w:bottom w:val="single" w:sz="6" w:color="000000"/>
               <w:right w:val="single" w:sz="6" w:color="000000"/>
             </w:tcBorders>
+            <w:vAlign w:val="center"/>
           </w:tcPr>
           <w:p>
             <w:pPr>
@@ -194,13 +197,13 @@
           <w:tcPr>
             <w:tcW w:type="dxa" w:w="2664"/>
             <w:gridSpan w:val="2"/>
-            <w:vAlign w:val="center"/>
             <w:tcBorders>
               <w:top w:val="single" w:sz="6" w:color="000000"/>
               <w:left w:val="single" w:sz="6" w:color="000000"/>
               <w:bottom w:val="single" w:sz="6" w:color="000000"/>
               <w:right w:val="single" w:sz="6" w:color="000000"/>
             </w:tcBorders>
+            <w:vAlign w:val="center"/>
           </w:tcPr>
           <w:p>
             <w:pPr>
@@ -222,13 +225,13 @@
           <w:tcPr>
             <w:tcW w:type="dxa" w:w="2664"/>
             <w:gridSpan w:val="2"/>
-            <w:vAlign w:val="center"/>
             <w:tcBorders>
               <w:top w:val="single" w:sz="6" w:color="000000"/>
               <w:left w:val="single" w:sz="6" w:color="000000"/>
               <w:bottom w:val="single" w:sz="6" w:color="000000"/>
               <w:right w:val="single" w:sz="6" w:color="000000"/>
             </w:tcBorders>
+            <w:vAlign w:val="center"/>
           </w:tcPr>
           <w:p>
             <w:pPr>
@@ -250,13 +253,13 @@
           <w:tcPr>
             <w:tcW w:type="dxa" w:w="1616"/>
             <w:vMerge w:val="restart"/>
-            <w:vAlign w:val="center"/>
             <w:tcBorders>
               <w:top w:val="single" w:sz="6" w:color="000000"/>
               <w:left w:val="single" w:sz="6" w:color="000000"/>
               <w:bottom w:val="single" w:sz="6" w:color="000000"/>
               <w:right w:val="single" w:sz="6" w:color="000000"/>
             </w:tcBorders>
+            <w:vAlign w:val="center"/>
           </w:tcPr>
           <w:p>
             <w:pPr>
@@ -280,13 +283,13 @@
           <w:tcPr>
             <w:tcW w:type="dxa" w:w="1332"/>
             <w:vMerge w:val="restart"/>
-            <w:vAlign w:val="center"/>
             <w:tcBorders>
               <w:top w:val="single" w:sz="6" w:color="000000"/>
               <w:left w:val="single" w:sz="6" w:color="000000"/>
               <w:bottom w:val="single" w:sz="6" w:color="000000"/>
               <w:right w:val="single" w:sz="6" w:color="000000"/>
             </w:tcBorders>
+            <w:vAlign w:val="center"/>
           </w:tcPr>
           <w:p>
             <w:pPr>
@@ -6493,7 +6496,7 @@
               </w:rPr>
               <w:t>________________________</w:t>
               <w:br/>
-              <w:t>{{current_date}}</w:t>
+              <w:t>{{employee_signature_date}}</w:t>
             </w:r>
           </w:p>
         </w:tc>
@@ -6522,7 +6525,7 @@
               </w:rPr>
               <w:t>________________________</w:t>
               <w:br/>
-              <w:t>{{current_date}}</w:t>
+              <w:t>{{employer_signature_date}}</w:t>
             </w:r>
           </w:p>
         </w:tc>

</xml_diff>

<commit_message>
Keep monthly report signatures on one page
</commit_message>
<xml_diff>
--- a/apps/api/templates/Arbeitszeitaufzeichnung_Template.docx
+++ b/apps/api/templates/Arbeitszeitaufzeichnung_Template.docx
@@ -140,11 +140,6 @@
         </w:tc>
       </w:tr>
     </w:tbl>
-    <w:p>
-      <w:pPr>
-        <w:spacing w:after="80"/>
-      </w:pPr>
-    </w:p>
     <w:tbl>
       <w:tblPr>
         <w:tblW w:type="dxa" w:w="10710"/>
@@ -441,7 +436,7 @@
       </w:tr>
       <w:tr>
         <w:trPr>
-          <w:trHeight w:val="306"/>
+          <w:trHeight w:val="272" w:hRule="exact"/>
         </w:trPr>
         <w:tc>
           <w:tcPr>
@@ -635,7 +630,7 @@
       </w:tr>
       <w:tr>
         <w:trPr>
-          <w:trHeight w:val="306"/>
+          <w:trHeight w:val="272" w:hRule="exact"/>
         </w:trPr>
         <w:tc>
           <w:tcPr>
@@ -829,7 +824,7 @@
       </w:tr>
       <w:tr>
         <w:trPr>
-          <w:trHeight w:val="306"/>
+          <w:trHeight w:val="272" w:hRule="exact"/>
         </w:trPr>
         <w:tc>
           <w:tcPr>
@@ -1023,7 +1018,7 @@
       </w:tr>
       <w:tr>
         <w:trPr>
-          <w:trHeight w:val="306"/>
+          <w:trHeight w:val="272" w:hRule="exact"/>
         </w:trPr>
         <w:tc>
           <w:tcPr>
@@ -1217,7 +1212,7 @@
       </w:tr>
       <w:tr>
         <w:trPr>
-          <w:trHeight w:val="306"/>
+          <w:trHeight w:val="272" w:hRule="exact"/>
         </w:trPr>
         <w:tc>
           <w:tcPr>
@@ -1411,7 +1406,7 @@
       </w:tr>
       <w:tr>
         <w:trPr>
-          <w:trHeight w:val="306"/>
+          <w:trHeight w:val="272" w:hRule="exact"/>
         </w:trPr>
         <w:tc>
           <w:tcPr>
@@ -1605,7 +1600,7 @@
       </w:tr>
       <w:tr>
         <w:trPr>
-          <w:trHeight w:val="306"/>
+          <w:trHeight w:val="272" w:hRule="exact"/>
         </w:trPr>
         <w:tc>
           <w:tcPr>
@@ -1799,7 +1794,7 @@
       </w:tr>
       <w:tr>
         <w:trPr>
-          <w:trHeight w:val="306"/>
+          <w:trHeight w:val="272" w:hRule="exact"/>
         </w:trPr>
         <w:tc>
           <w:tcPr>
@@ -1993,7 +1988,7 @@
       </w:tr>
       <w:tr>
         <w:trPr>
-          <w:trHeight w:val="306"/>
+          <w:trHeight w:val="272" w:hRule="exact"/>
         </w:trPr>
         <w:tc>
           <w:tcPr>
@@ -2187,7 +2182,7 @@
       </w:tr>
       <w:tr>
         <w:trPr>
-          <w:trHeight w:val="306"/>
+          <w:trHeight w:val="272" w:hRule="exact"/>
         </w:trPr>
         <w:tc>
           <w:tcPr>
@@ -2381,7 +2376,7 @@
       </w:tr>
       <w:tr>
         <w:trPr>
-          <w:trHeight w:val="306"/>
+          <w:trHeight w:val="272" w:hRule="exact"/>
         </w:trPr>
         <w:tc>
           <w:tcPr>
@@ -2575,7 +2570,7 @@
       </w:tr>
       <w:tr>
         <w:trPr>
-          <w:trHeight w:val="306"/>
+          <w:trHeight w:val="272" w:hRule="exact"/>
         </w:trPr>
         <w:tc>
           <w:tcPr>
@@ -2769,7 +2764,7 @@
       </w:tr>
       <w:tr>
         <w:trPr>
-          <w:trHeight w:val="306"/>
+          <w:trHeight w:val="272" w:hRule="exact"/>
         </w:trPr>
         <w:tc>
           <w:tcPr>
@@ -2963,7 +2958,7 @@
       </w:tr>
       <w:tr>
         <w:trPr>
-          <w:trHeight w:val="306"/>
+          <w:trHeight w:val="272" w:hRule="exact"/>
         </w:trPr>
         <w:tc>
           <w:tcPr>
@@ -3157,7 +3152,7 @@
       </w:tr>
       <w:tr>
         <w:trPr>
-          <w:trHeight w:val="306"/>
+          <w:trHeight w:val="272" w:hRule="exact"/>
         </w:trPr>
         <w:tc>
           <w:tcPr>
@@ -3351,7 +3346,7 @@
       </w:tr>
       <w:tr>
         <w:trPr>
-          <w:trHeight w:val="306"/>
+          <w:trHeight w:val="272" w:hRule="exact"/>
         </w:trPr>
         <w:tc>
           <w:tcPr>
@@ -3545,7 +3540,7 @@
       </w:tr>
       <w:tr>
         <w:trPr>
-          <w:trHeight w:val="306"/>
+          <w:trHeight w:val="272" w:hRule="exact"/>
         </w:trPr>
         <w:tc>
           <w:tcPr>
@@ -3739,7 +3734,7 @@
       </w:tr>
       <w:tr>
         <w:trPr>
-          <w:trHeight w:val="306"/>
+          <w:trHeight w:val="272" w:hRule="exact"/>
         </w:trPr>
         <w:tc>
           <w:tcPr>
@@ -3933,7 +3928,7 @@
       </w:tr>
       <w:tr>
         <w:trPr>
-          <w:trHeight w:val="306"/>
+          <w:trHeight w:val="272" w:hRule="exact"/>
         </w:trPr>
         <w:tc>
           <w:tcPr>
@@ -4127,7 +4122,7 @@
       </w:tr>
       <w:tr>
         <w:trPr>
-          <w:trHeight w:val="306"/>
+          <w:trHeight w:val="272" w:hRule="exact"/>
         </w:trPr>
         <w:tc>
           <w:tcPr>
@@ -4321,7 +4316,7 @@
       </w:tr>
       <w:tr>
         <w:trPr>
-          <w:trHeight w:val="306"/>
+          <w:trHeight w:val="272" w:hRule="exact"/>
         </w:trPr>
         <w:tc>
           <w:tcPr>
@@ -4515,7 +4510,7 @@
       </w:tr>
       <w:tr>
         <w:trPr>
-          <w:trHeight w:val="306"/>
+          <w:trHeight w:val="272" w:hRule="exact"/>
         </w:trPr>
         <w:tc>
           <w:tcPr>
@@ -4709,7 +4704,7 @@
       </w:tr>
       <w:tr>
         <w:trPr>
-          <w:trHeight w:val="306"/>
+          <w:trHeight w:val="272" w:hRule="exact"/>
         </w:trPr>
         <w:tc>
           <w:tcPr>
@@ -4903,7 +4898,7 @@
       </w:tr>
       <w:tr>
         <w:trPr>
-          <w:trHeight w:val="306"/>
+          <w:trHeight w:val="272" w:hRule="exact"/>
         </w:trPr>
         <w:tc>
           <w:tcPr>
@@ -5097,7 +5092,7 @@
       </w:tr>
       <w:tr>
         <w:trPr>
-          <w:trHeight w:val="306"/>
+          <w:trHeight w:val="272" w:hRule="exact"/>
         </w:trPr>
         <w:tc>
           <w:tcPr>
@@ -5291,7 +5286,7 @@
       </w:tr>
       <w:tr>
         <w:trPr>
-          <w:trHeight w:val="306"/>
+          <w:trHeight w:val="272" w:hRule="exact"/>
         </w:trPr>
         <w:tc>
           <w:tcPr>
@@ -5485,7 +5480,7 @@
       </w:tr>
       <w:tr>
         <w:trPr>
-          <w:trHeight w:val="306"/>
+          <w:trHeight w:val="272" w:hRule="exact"/>
         </w:trPr>
         <w:tc>
           <w:tcPr>
@@ -5679,7 +5674,7 @@
       </w:tr>
       <w:tr>
         <w:trPr>
-          <w:trHeight w:val="306"/>
+          <w:trHeight w:val="272" w:hRule="exact"/>
         </w:trPr>
         <w:tc>
           <w:tcPr>
@@ -5873,7 +5868,7 @@
       </w:tr>
       <w:tr>
         <w:trPr>
-          <w:trHeight w:val="306"/>
+          <w:trHeight w:val="272" w:hRule="exact"/>
         </w:trPr>
         <w:tc>
           <w:tcPr>
@@ -6067,7 +6062,7 @@
       </w:tr>
       <w:tr>
         <w:trPr>
-          <w:trHeight w:val="306"/>
+          <w:trHeight w:val="272" w:hRule="exact"/>
         </w:trPr>
         <w:tc>
           <w:tcPr>
@@ -6261,7 +6256,7 @@
       </w:tr>
       <w:tr>
         <w:trPr>
-          <w:trHeight w:val="306"/>
+          <w:trHeight w:val="272" w:hRule="exact"/>
         </w:trPr>
         <w:tc>
           <w:tcPr>
@@ -6454,11 +6449,6 @@
         </w:tc>
       </w:tr>
     </w:tbl>
-    <w:p>
-      <w:pPr>
-        <w:spacing w:after="60"/>
-      </w:pPr>
-    </w:p>
     <w:tbl>
       <w:tblPr>
         <w:tblW w:type="dxa" w:w="10710"/>
@@ -6471,6 +6461,9 @@
         <w:gridCol w:w="5355"/>
       </w:tblGrid>
       <w:tr>
+        <w:trPr>
+          <w:trHeight w:val="499" w:hRule="exact"/>
+        </w:trPr>
         <w:tc>
           <w:tcPr>
             <w:tcW w:type="dxa" w:w="4876"/>
@@ -6531,6 +6524,9 @@
         </w:tc>
       </w:tr>
       <w:tr>
+        <w:trPr>
+          <w:trHeight w:val="499" w:hRule="exact"/>
+        </w:trPr>
         <w:tc>
           <w:tcPr>
             <w:tcW w:type="dxa" w:w="4876"/>
@@ -6545,7 +6541,7 @@
           <w:p>
             <w:pPr>
               <w:spacing w:after="0" w:before="0"/>
-              <w:jc w:val="left"/>
+              <w:jc w:val="center"/>
             </w:pPr>
             <w:r/>
             <w:r>
@@ -6554,9 +6550,7 @@
                 <w:b w:val="0"/>
                 <w:sz w:val="18"/>
               </w:rPr>
-              <w:t>{{employee_signature}}</w:t>
-              <w:br/>
-              <w:t>Unterschrift Arbeitnehmer/in</w:t>
+              <w:t>{{employee_signature}}Unterschrift Arbeitnehmer/in</w:t>
             </w:r>
           </w:p>
         </w:tc>

</xml_diff>

<commit_message>
Separate report signature from its caption
</commit_message>
<xml_diff>
--- a/apps/api/templates/Arbeitszeitaufzeichnung_Template.docx
+++ b/apps/api/templates/Arbeitszeitaufzeichnung_Template.docx
@@ -436,7 +436,7 @@
       </w:tr>
       <w:tr>
         <w:trPr>
-          <w:trHeight w:val="272" w:hRule="exact"/>
+          <w:trHeight w:val="255" w:hRule="exact"/>
         </w:trPr>
         <w:tc>
           <w:tcPr>
@@ -630,7 +630,7 @@
       </w:tr>
       <w:tr>
         <w:trPr>
-          <w:trHeight w:val="272" w:hRule="exact"/>
+          <w:trHeight w:val="255" w:hRule="exact"/>
         </w:trPr>
         <w:tc>
           <w:tcPr>
@@ -824,7 +824,7 @@
       </w:tr>
       <w:tr>
         <w:trPr>
-          <w:trHeight w:val="272" w:hRule="exact"/>
+          <w:trHeight w:val="255" w:hRule="exact"/>
         </w:trPr>
         <w:tc>
           <w:tcPr>
@@ -1018,7 +1018,7 @@
       </w:tr>
       <w:tr>
         <w:trPr>
-          <w:trHeight w:val="272" w:hRule="exact"/>
+          <w:trHeight w:val="255" w:hRule="exact"/>
         </w:trPr>
         <w:tc>
           <w:tcPr>
@@ -1212,7 +1212,7 @@
       </w:tr>
       <w:tr>
         <w:trPr>
-          <w:trHeight w:val="272" w:hRule="exact"/>
+          <w:trHeight w:val="255" w:hRule="exact"/>
         </w:trPr>
         <w:tc>
           <w:tcPr>
@@ -1406,7 +1406,7 @@
       </w:tr>
       <w:tr>
         <w:trPr>
-          <w:trHeight w:val="272" w:hRule="exact"/>
+          <w:trHeight w:val="255" w:hRule="exact"/>
         </w:trPr>
         <w:tc>
           <w:tcPr>
@@ -1600,7 +1600,7 @@
       </w:tr>
       <w:tr>
         <w:trPr>
-          <w:trHeight w:val="272" w:hRule="exact"/>
+          <w:trHeight w:val="255" w:hRule="exact"/>
         </w:trPr>
         <w:tc>
           <w:tcPr>
@@ -1794,7 +1794,7 @@
       </w:tr>
       <w:tr>
         <w:trPr>
-          <w:trHeight w:val="272" w:hRule="exact"/>
+          <w:trHeight w:val="255" w:hRule="exact"/>
         </w:trPr>
         <w:tc>
           <w:tcPr>
@@ -1988,7 +1988,7 @@
       </w:tr>
       <w:tr>
         <w:trPr>
-          <w:trHeight w:val="272" w:hRule="exact"/>
+          <w:trHeight w:val="255" w:hRule="exact"/>
         </w:trPr>
         <w:tc>
           <w:tcPr>
@@ -2182,7 +2182,7 @@
       </w:tr>
       <w:tr>
         <w:trPr>
-          <w:trHeight w:val="272" w:hRule="exact"/>
+          <w:trHeight w:val="255" w:hRule="exact"/>
         </w:trPr>
         <w:tc>
           <w:tcPr>
@@ -2376,7 +2376,7 @@
       </w:tr>
       <w:tr>
         <w:trPr>
-          <w:trHeight w:val="272" w:hRule="exact"/>
+          <w:trHeight w:val="255" w:hRule="exact"/>
         </w:trPr>
         <w:tc>
           <w:tcPr>
@@ -2570,7 +2570,7 @@
       </w:tr>
       <w:tr>
         <w:trPr>
-          <w:trHeight w:val="272" w:hRule="exact"/>
+          <w:trHeight w:val="255" w:hRule="exact"/>
         </w:trPr>
         <w:tc>
           <w:tcPr>
@@ -2764,7 +2764,7 @@
       </w:tr>
       <w:tr>
         <w:trPr>
-          <w:trHeight w:val="272" w:hRule="exact"/>
+          <w:trHeight w:val="255" w:hRule="exact"/>
         </w:trPr>
         <w:tc>
           <w:tcPr>
@@ -2958,7 +2958,7 @@
       </w:tr>
       <w:tr>
         <w:trPr>
-          <w:trHeight w:val="272" w:hRule="exact"/>
+          <w:trHeight w:val="255" w:hRule="exact"/>
         </w:trPr>
         <w:tc>
           <w:tcPr>
@@ -3152,7 +3152,7 @@
       </w:tr>
       <w:tr>
         <w:trPr>
-          <w:trHeight w:val="272" w:hRule="exact"/>
+          <w:trHeight w:val="255" w:hRule="exact"/>
         </w:trPr>
         <w:tc>
           <w:tcPr>
@@ -3346,7 +3346,7 @@
       </w:tr>
       <w:tr>
         <w:trPr>
-          <w:trHeight w:val="272" w:hRule="exact"/>
+          <w:trHeight w:val="255" w:hRule="exact"/>
         </w:trPr>
         <w:tc>
           <w:tcPr>
@@ -3540,7 +3540,7 @@
       </w:tr>
       <w:tr>
         <w:trPr>
-          <w:trHeight w:val="272" w:hRule="exact"/>
+          <w:trHeight w:val="255" w:hRule="exact"/>
         </w:trPr>
         <w:tc>
           <w:tcPr>
@@ -3734,7 +3734,7 @@
       </w:tr>
       <w:tr>
         <w:trPr>
-          <w:trHeight w:val="272" w:hRule="exact"/>
+          <w:trHeight w:val="255" w:hRule="exact"/>
         </w:trPr>
         <w:tc>
           <w:tcPr>
@@ -3928,7 +3928,7 @@
       </w:tr>
       <w:tr>
         <w:trPr>
-          <w:trHeight w:val="272" w:hRule="exact"/>
+          <w:trHeight w:val="255" w:hRule="exact"/>
         </w:trPr>
         <w:tc>
           <w:tcPr>
@@ -4122,7 +4122,7 @@
       </w:tr>
       <w:tr>
         <w:trPr>
-          <w:trHeight w:val="272" w:hRule="exact"/>
+          <w:trHeight w:val="255" w:hRule="exact"/>
         </w:trPr>
         <w:tc>
           <w:tcPr>
@@ -4316,7 +4316,7 @@
       </w:tr>
       <w:tr>
         <w:trPr>
-          <w:trHeight w:val="272" w:hRule="exact"/>
+          <w:trHeight w:val="255" w:hRule="exact"/>
         </w:trPr>
         <w:tc>
           <w:tcPr>
@@ -4510,7 +4510,7 @@
       </w:tr>
       <w:tr>
         <w:trPr>
-          <w:trHeight w:val="272" w:hRule="exact"/>
+          <w:trHeight w:val="255" w:hRule="exact"/>
         </w:trPr>
         <w:tc>
           <w:tcPr>
@@ -4704,7 +4704,7 @@
       </w:tr>
       <w:tr>
         <w:trPr>
-          <w:trHeight w:val="272" w:hRule="exact"/>
+          <w:trHeight w:val="255" w:hRule="exact"/>
         </w:trPr>
         <w:tc>
           <w:tcPr>
@@ -4898,7 +4898,7 @@
       </w:tr>
       <w:tr>
         <w:trPr>
-          <w:trHeight w:val="272" w:hRule="exact"/>
+          <w:trHeight w:val="255" w:hRule="exact"/>
         </w:trPr>
         <w:tc>
           <w:tcPr>
@@ -5092,7 +5092,7 @@
       </w:tr>
       <w:tr>
         <w:trPr>
-          <w:trHeight w:val="272" w:hRule="exact"/>
+          <w:trHeight w:val="255" w:hRule="exact"/>
         </w:trPr>
         <w:tc>
           <w:tcPr>
@@ -5286,7 +5286,7 @@
       </w:tr>
       <w:tr>
         <w:trPr>
-          <w:trHeight w:val="272" w:hRule="exact"/>
+          <w:trHeight w:val="255" w:hRule="exact"/>
         </w:trPr>
         <w:tc>
           <w:tcPr>
@@ -5480,7 +5480,7 @@
       </w:tr>
       <w:tr>
         <w:trPr>
-          <w:trHeight w:val="272" w:hRule="exact"/>
+          <w:trHeight w:val="255" w:hRule="exact"/>
         </w:trPr>
         <w:tc>
           <w:tcPr>
@@ -5674,7 +5674,7 @@
       </w:tr>
       <w:tr>
         <w:trPr>
-          <w:trHeight w:val="272" w:hRule="exact"/>
+          <w:trHeight w:val="255" w:hRule="exact"/>
         </w:trPr>
         <w:tc>
           <w:tcPr>
@@ -5868,7 +5868,7 @@
       </w:tr>
       <w:tr>
         <w:trPr>
-          <w:trHeight w:val="272" w:hRule="exact"/>
+          <w:trHeight w:val="255" w:hRule="exact"/>
         </w:trPr>
         <w:tc>
           <w:tcPr>
@@ -6062,7 +6062,7 @@
       </w:tr>
       <w:tr>
         <w:trPr>
-          <w:trHeight w:val="272" w:hRule="exact"/>
+          <w:trHeight w:val="255" w:hRule="exact"/>
         </w:trPr>
         <w:tc>
           <w:tcPr>
@@ -6256,7 +6256,7 @@
       </w:tr>
       <w:tr>
         <w:trPr>
-          <w:trHeight w:val="272" w:hRule="exact"/>
+          <w:trHeight w:val="255" w:hRule="exact"/>
         </w:trPr>
         <w:tc>
           <w:tcPr>
@@ -6525,8 +6525,43 @@
       </w:tr>
       <w:tr>
         <w:trPr>
-          <w:trHeight w:val="499" w:hRule="exact"/>
+          <w:trHeight w:val="822" w:hRule="atLeast"/>
         </w:trPr>
+        <w:tc>
+          <w:tcPr>
+            <w:tcW w:type="dxa" w:w="4876"/>
+            <w:vAlign w:val="center"/>
+            <w:tcBorders>
+              <w:top w:val="single" w:sz="6" w:color="000000"/>
+              <w:left w:val="single" w:sz="6" w:color="000000"/>
+              <w:bottom w:val="single" w:sz="6" w:color="000000"/>
+              <w:right w:val="single" w:sz="6" w:color="000000"/>
+            </w:tcBorders>
+          </w:tcPr>
+          <w:p>
+            <w:pPr>
+              <w:spacing w:before="0" w:after="0"/>
+              <w:jc w:val="center"/>
+            </w:pPr>
+            <w:r/>
+            <w:r>
+              <w:t>{{employee_signature}}</w:t>
+            </w:r>
+          </w:p>
+          <w:p>
+            <w:pPr>
+              <w:spacing w:before="0" w:after="0"/>
+              <w:jc w:val="center"/>
+            </w:pPr>
+            <w:r>
+              <w:rPr>
+                <w:rFonts w:ascii="Arial" w:hAnsi="Arial"/>
+                <w:sz w:val="18"/>
+              </w:rPr>
+              <w:t>Unterschrift Arbeitnehmer/in</w:t>
+            </w:r>
+          </w:p>
+        </w:tc>
         <w:tc>
           <w:tcPr>
             <w:tcW w:type="dxa" w:w="4876"/>
@@ -6550,35 +6585,6 @@
                 <w:b w:val="0"/>
                 <w:sz w:val="18"/>
               </w:rPr>
-              <w:t>{{employee_signature}}Unterschrift Arbeitnehmer/in</w:t>
-            </w:r>
-          </w:p>
-        </w:tc>
-        <w:tc>
-          <w:tcPr>
-            <w:tcW w:type="dxa" w:w="4876"/>
-            <w:vAlign w:val="center"/>
-            <w:tcBorders>
-              <w:top w:val="single" w:sz="6" w:color="000000"/>
-              <w:left w:val="single" w:sz="6" w:color="000000"/>
-              <w:bottom w:val="single" w:sz="6" w:color="000000"/>
-              <w:right w:val="single" w:sz="6" w:color="000000"/>
-            </w:tcBorders>
-          </w:tcPr>
-          <w:p>
-            <w:pPr>
-              <w:spacing w:after="0" w:before="0"/>
-              <w:jc w:val="left"/>
-            </w:pPr>
-            <w:r/>
-            <w:r>
-              <w:rPr>
-                <w:rFonts w:ascii="Arial" w:hAnsi="Arial"/>
-                <w:b w:val="0"/>
-                <w:sz w:val="18"/>
-              </w:rPr>
-              <w:t>{{employer_signature}}</w:t>
-              <w:br/>
               <w:t>Unterschrift Arbeitgeber/in</w:t>
             </w:r>
           </w:p>

</xml_diff>

<commit_message>
Keep report signatures within their cells
</commit_message>
<xml_diff>
--- a/apps/api/templates/Arbeitszeitaufzeichnung_Template.docx
+++ b/apps/api/templates/Arbeitszeitaufzeichnung_Template.docx
@@ -436,7 +436,7 @@
       </w:tr>
       <w:tr>
         <w:trPr>
-          <w:trHeight w:val="255" w:hRule="exact"/>
+          <w:trHeight w:val="227" w:hRule="exact"/>
         </w:trPr>
         <w:tc>
           <w:tcPr>
@@ -630,7 +630,7 @@
       </w:tr>
       <w:tr>
         <w:trPr>
-          <w:trHeight w:val="255" w:hRule="exact"/>
+          <w:trHeight w:val="227" w:hRule="exact"/>
         </w:trPr>
         <w:tc>
           <w:tcPr>
@@ -824,7 +824,7 @@
       </w:tr>
       <w:tr>
         <w:trPr>
-          <w:trHeight w:val="255" w:hRule="exact"/>
+          <w:trHeight w:val="227" w:hRule="exact"/>
         </w:trPr>
         <w:tc>
           <w:tcPr>
@@ -1018,7 +1018,7 @@
       </w:tr>
       <w:tr>
         <w:trPr>
-          <w:trHeight w:val="255" w:hRule="exact"/>
+          <w:trHeight w:val="227" w:hRule="exact"/>
         </w:trPr>
         <w:tc>
           <w:tcPr>
@@ -1212,7 +1212,7 @@
       </w:tr>
       <w:tr>
         <w:trPr>
-          <w:trHeight w:val="255" w:hRule="exact"/>
+          <w:trHeight w:val="227" w:hRule="exact"/>
         </w:trPr>
         <w:tc>
           <w:tcPr>
@@ -1406,7 +1406,7 @@
       </w:tr>
       <w:tr>
         <w:trPr>
-          <w:trHeight w:val="255" w:hRule="exact"/>
+          <w:trHeight w:val="227" w:hRule="exact"/>
         </w:trPr>
         <w:tc>
           <w:tcPr>
@@ -1600,7 +1600,7 @@
       </w:tr>
       <w:tr>
         <w:trPr>
-          <w:trHeight w:val="255" w:hRule="exact"/>
+          <w:trHeight w:val="227" w:hRule="exact"/>
         </w:trPr>
         <w:tc>
           <w:tcPr>
@@ -1794,7 +1794,7 @@
       </w:tr>
       <w:tr>
         <w:trPr>
-          <w:trHeight w:val="255" w:hRule="exact"/>
+          <w:trHeight w:val="227" w:hRule="exact"/>
         </w:trPr>
         <w:tc>
           <w:tcPr>
@@ -1988,7 +1988,7 @@
       </w:tr>
       <w:tr>
         <w:trPr>
-          <w:trHeight w:val="255" w:hRule="exact"/>
+          <w:trHeight w:val="227" w:hRule="exact"/>
         </w:trPr>
         <w:tc>
           <w:tcPr>
@@ -2182,7 +2182,7 @@
       </w:tr>
       <w:tr>
         <w:trPr>
-          <w:trHeight w:val="255" w:hRule="exact"/>
+          <w:trHeight w:val="227" w:hRule="exact"/>
         </w:trPr>
         <w:tc>
           <w:tcPr>
@@ -2376,7 +2376,7 @@
       </w:tr>
       <w:tr>
         <w:trPr>
-          <w:trHeight w:val="255" w:hRule="exact"/>
+          <w:trHeight w:val="227" w:hRule="exact"/>
         </w:trPr>
         <w:tc>
           <w:tcPr>
@@ -2570,7 +2570,7 @@
       </w:tr>
       <w:tr>
         <w:trPr>
-          <w:trHeight w:val="255" w:hRule="exact"/>
+          <w:trHeight w:val="227" w:hRule="exact"/>
         </w:trPr>
         <w:tc>
           <w:tcPr>
@@ -2764,7 +2764,7 @@
       </w:tr>
       <w:tr>
         <w:trPr>
-          <w:trHeight w:val="255" w:hRule="exact"/>
+          <w:trHeight w:val="227" w:hRule="exact"/>
         </w:trPr>
         <w:tc>
           <w:tcPr>
@@ -2958,7 +2958,7 @@
       </w:tr>
       <w:tr>
         <w:trPr>
-          <w:trHeight w:val="255" w:hRule="exact"/>
+          <w:trHeight w:val="227" w:hRule="exact"/>
         </w:trPr>
         <w:tc>
           <w:tcPr>
@@ -3152,7 +3152,7 @@
       </w:tr>
       <w:tr>
         <w:trPr>
-          <w:trHeight w:val="255" w:hRule="exact"/>
+          <w:trHeight w:val="227" w:hRule="exact"/>
         </w:trPr>
         <w:tc>
           <w:tcPr>
@@ -3346,7 +3346,7 @@
       </w:tr>
       <w:tr>
         <w:trPr>
-          <w:trHeight w:val="255" w:hRule="exact"/>
+          <w:trHeight w:val="227" w:hRule="exact"/>
         </w:trPr>
         <w:tc>
           <w:tcPr>
@@ -3540,7 +3540,7 @@
       </w:tr>
       <w:tr>
         <w:trPr>
-          <w:trHeight w:val="255" w:hRule="exact"/>
+          <w:trHeight w:val="227" w:hRule="exact"/>
         </w:trPr>
         <w:tc>
           <w:tcPr>
@@ -3734,7 +3734,7 @@
       </w:tr>
       <w:tr>
         <w:trPr>
-          <w:trHeight w:val="255" w:hRule="exact"/>
+          <w:trHeight w:val="227" w:hRule="exact"/>
         </w:trPr>
         <w:tc>
           <w:tcPr>
@@ -3928,7 +3928,7 @@
       </w:tr>
       <w:tr>
         <w:trPr>
-          <w:trHeight w:val="255" w:hRule="exact"/>
+          <w:trHeight w:val="227" w:hRule="exact"/>
         </w:trPr>
         <w:tc>
           <w:tcPr>
@@ -4122,7 +4122,7 @@
       </w:tr>
       <w:tr>
         <w:trPr>
-          <w:trHeight w:val="255" w:hRule="exact"/>
+          <w:trHeight w:val="227" w:hRule="exact"/>
         </w:trPr>
         <w:tc>
           <w:tcPr>
@@ -4316,7 +4316,7 @@
       </w:tr>
       <w:tr>
         <w:trPr>
-          <w:trHeight w:val="255" w:hRule="exact"/>
+          <w:trHeight w:val="227" w:hRule="exact"/>
         </w:trPr>
         <w:tc>
           <w:tcPr>
@@ -4510,7 +4510,7 @@
       </w:tr>
       <w:tr>
         <w:trPr>
-          <w:trHeight w:val="255" w:hRule="exact"/>
+          <w:trHeight w:val="227" w:hRule="exact"/>
         </w:trPr>
         <w:tc>
           <w:tcPr>
@@ -4704,7 +4704,7 @@
       </w:tr>
       <w:tr>
         <w:trPr>
-          <w:trHeight w:val="255" w:hRule="exact"/>
+          <w:trHeight w:val="227" w:hRule="exact"/>
         </w:trPr>
         <w:tc>
           <w:tcPr>
@@ -4898,7 +4898,7 @@
       </w:tr>
       <w:tr>
         <w:trPr>
-          <w:trHeight w:val="255" w:hRule="exact"/>
+          <w:trHeight w:val="227" w:hRule="exact"/>
         </w:trPr>
         <w:tc>
           <w:tcPr>
@@ -5092,7 +5092,7 @@
       </w:tr>
       <w:tr>
         <w:trPr>
-          <w:trHeight w:val="255" w:hRule="exact"/>
+          <w:trHeight w:val="227" w:hRule="exact"/>
         </w:trPr>
         <w:tc>
           <w:tcPr>
@@ -5286,7 +5286,7 @@
       </w:tr>
       <w:tr>
         <w:trPr>
-          <w:trHeight w:val="255" w:hRule="exact"/>
+          <w:trHeight w:val="227" w:hRule="exact"/>
         </w:trPr>
         <w:tc>
           <w:tcPr>
@@ -5480,7 +5480,7 @@
       </w:tr>
       <w:tr>
         <w:trPr>
-          <w:trHeight w:val="255" w:hRule="exact"/>
+          <w:trHeight w:val="227" w:hRule="exact"/>
         </w:trPr>
         <w:tc>
           <w:tcPr>
@@ -5674,7 +5674,7 @@
       </w:tr>
       <w:tr>
         <w:trPr>
-          <w:trHeight w:val="255" w:hRule="exact"/>
+          <w:trHeight w:val="227" w:hRule="exact"/>
         </w:trPr>
         <w:tc>
           <w:tcPr>
@@ -5868,7 +5868,7 @@
       </w:tr>
       <w:tr>
         <w:trPr>
-          <w:trHeight w:val="255" w:hRule="exact"/>
+          <w:trHeight w:val="227" w:hRule="exact"/>
         </w:trPr>
         <w:tc>
           <w:tcPr>
@@ -6062,7 +6062,7 @@
       </w:tr>
       <w:tr>
         <w:trPr>
-          <w:trHeight w:val="255" w:hRule="exact"/>
+          <w:trHeight w:val="227" w:hRule="exact"/>
         </w:trPr>
         <w:tc>
           <w:tcPr>
@@ -6256,7 +6256,7 @@
       </w:tr>
       <w:tr>
         <w:trPr>
-          <w:trHeight w:val="255" w:hRule="exact"/>
+          <w:trHeight w:val="227" w:hRule="exact"/>
         </w:trPr>
         <w:tc>
           <w:tcPr>
@@ -6525,7 +6525,7 @@
       </w:tr>
       <w:tr>
         <w:trPr>
-          <w:trHeight w:val="822" w:hRule="atLeast"/>
+          <w:trHeight w:val="1134" w:hRule="atLeast"/>
         </w:trPr>
         <w:tc>
           <w:tcPr>
@@ -6540,7 +6540,7 @@
           </w:tcPr>
           <w:p>
             <w:pPr>
-              <w:spacing w:before="0" w:after="0"/>
+              <w:spacing w:before="0" w:after="0" w:line="880" w:lineRule="exact"/>
               <w:jc w:val="center"/>
             </w:pPr>
             <w:r/>

</xml_diff>